<commit_message>
confirmation de cahier des charges
</commit_message>
<xml_diff>
--- a/cahier des charges.docx
+++ b/cahier des charges.docx
@@ -343,9 +343,8 @@
           <w:sz w:val="28"/>
           <w:szCs w:val="28"/>
         </w:rPr>
-        <w:t xml:space="preserve">Encadré par : </w:t>
-      </w:r>
-      <w:proofErr w:type="spellStart"/>
+        <w:t xml:space="preserve">Encadré par : Yassnine </w:t>
+      </w:r>
       <w:r>
         <w:rPr>
           <w:b/>
@@ -355,9 +354,8 @@
           <w:sz w:val="28"/>
           <w:szCs w:val="28"/>
         </w:rPr>
-        <w:t>Yassnine</w:t>
-      </w:r>
-      <w:proofErr w:type="spellEnd"/>
+        <w:t>A</w:t>
+      </w:r>
       <w:r>
         <w:rPr>
           <w:b/>
@@ -367,111 +365,112 @@
           <w:sz w:val="28"/>
           <w:szCs w:val="28"/>
         </w:rPr>
-        <w:t xml:space="preserve"> </w:t>
-      </w:r>
-      <w:r>
-        <w:rPr>
-          <w:b/>
-          <w:bCs/>
+        <w:t>ammani</w:t>
+      </w:r>
+    </w:p>
+    <w:p>
+      <w:pPr>
+        <w:jc w:val="center"/>
+        <w:rPr>
+          <w:b/>
+          <w:bCs/>
+          <w:sz w:val="32"/>
+          <w:szCs w:val="32"/>
+        </w:rPr>
+      </w:pPr>
+    </w:p>
+    <w:p>
+      <w:pPr>
+        <w:rPr>
+          <w:b/>
+          <w:bCs/>
+          <w:sz w:val="32"/>
+          <w:szCs w:val="32"/>
+        </w:rPr>
+      </w:pPr>
+      <w:r>
+        <w:rPr>
+          <w:b/>
+          <w:bCs/>
+          <w:sz w:val="32"/>
+          <w:szCs w:val="32"/>
+        </w:rPr>
+        <w:br w:type="page"/>
+      </w:r>
+    </w:p>
+    <w:p>
+      <w:pPr>
+        <w:rPr>
+          <w:b/>
+          <w:bCs/>
+          <w:sz w:val="32"/>
+          <w:szCs w:val="32"/>
+        </w:rPr>
+      </w:pPr>
+    </w:p>
+    <w:p>
+      <w:pPr>
+        <w:jc w:val="center"/>
+        <w:rPr>
+          <w:b/>
+          <w:bCs/>
+          <w:sz w:val="32"/>
+          <w:szCs w:val="32"/>
+        </w:rPr>
+      </w:pPr>
+    </w:p>
+    <w:p>
+      <w:pPr>
+        <w:pStyle w:val="Title"/>
+      </w:pPr>
+    </w:p>
+    <w:p>
+      <w:pPr>
+        <w:pStyle w:val="Title"/>
+      </w:pPr>
+      <w:r>
+        <w:t>1. Présentation du projet</w:t>
+      </w:r>
+    </w:p>
+    <w:p>
+      <w:pPr>
+        <w:pStyle w:val="Subtitle"/>
+        <w:rPr>
+          <w:b/>
+          <w:bCs/>
+          <w:color w:val="1F497D" w:themeColor="text2"/>
+        </w:rPr>
+      </w:pPr>
+      <w:r>
+        <w:rPr>
+          <w:b/>
+          <w:bCs/>
+          <w:color w:val="1F497D" w:themeColor="text2"/>
+        </w:rPr>
+        <w:t>1.1 Contexte</w:t>
+      </w:r>
+    </w:p>
+    <w:p>
+      <w:pPr>
+        <w:pStyle w:val="Quote"/>
+        <w:jc w:val="both"/>
+        <w:rPr>
           <w:i w:val="0"/>
           <w:iCs w:val="0"/>
-          <w:sz w:val="28"/>
-          <w:szCs w:val="28"/>
-        </w:rPr>
-        <w:t>A</w:t>
-      </w:r>
-      <w:r>
-        <w:rPr>
-          <w:b/>
-          <w:bCs/>
+          <w:color w:val="000000" w:themeColor="text1"/>
+          <w:sz w:val="24"/>
+          <w:szCs w:val="24"/>
+        </w:rPr>
+      </w:pPr>
+      <w:r>
+        <w:rPr>
           <w:i w:val="0"/>
           <w:iCs w:val="0"/>
-          <w:sz w:val="28"/>
-          <w:szCs w:val="28"/>
-        </w:rPr>
-        <w:t>ammani</w:t>
-      </w:r>
-    </w:p>
-    <w:p>
-      <w:pPr>
-        <w:jc w:val="center"/>
-        <w:rPr>
-          <w:b/>
-          <w:bCs/>
-          <w:sz w:val="32"/>
-          <w:szCs w:val="32"/>
-        </w:rPr>
-      </w:pPr>
-    </w:p>
-    <w:p>
-      <w:pPr>
-        <w:rPr>
-          <w:b/>
-          <w:bCs/>
-          <w:sz w:val="32"/>
-          <w:szCs w:val="32"/>
-        </w:rPr>
-      </w:pPr>
-      <w:r>
-        <w:rPr>
-          <w:b/>
-          <w:bCs/>
-          <w:sz w:val="32"/>
-          <w:szCs w:val="32"/>
-        </w:rPr>
-        <w:br w:type="page"/>
-      </w:r>
-    </w:p>
-    <w:p>
-      <w:pPr>
-        <w:rPr>
-          <w:b/>
-          <w:bCs/>
-          <w:sz w:val="32"/>
-          <w:szCs w:val="32"/>
-        </w:rPr>
-      </w:pPr>
-    </w:p>
-    <w:p>
-      <w:pPr>
-        <w:jc w:val="center"/>
-        <w:rPr>
-          <w:b/>
-          <w:bCs/>
-          <w:sz w:val="32"/>
-          <w:szCs w:val="32"/>
-        </w:rPr>
-      </w:pPr>
-    </w:p>
-    <w:p>
-      <w:pPr>
-        <w:pStyle w:val="Title"/>
-      </w:pPr>
-    </w:p>
-    <w:p>
-      <w:pPr>
-        <w:pStyle w:val="Title"/>
-      </w:pPr>
-      <w:r>
-        <w:t>1. Présentation du projet</w:t>
-      </w:r>
-    </w:p>
-    <w:p>
-      <w:pPr>
-        <w:pStyle w:val="Subtitle"/>
-        <w:rPr>
-          <w:b/>
-          <w:bCs/>
-          <w:color w:val="1F497D" w:themeColor="text2"/>
-        </w:rPr>
-      </w:pPr>
-      <w:r>
-        <w:rPr>
-          <w:b/>
-          <w:bCs/>
-          <w:color w:val="1F497D" w:themeColor="text2"/>
-        </w:rPr>
-        <w:t>1.1 Contexte</w:t>
+          <w:color w:val="000000" w:themeColor="text1"/>
+          <w:sz w:val="24"/>
+          <w:szCs w:val="24"/>
+        </w:rPr>
+        <w:t>Dans un contexte mondial marqué par des crises climatiques, économiques et géopolitiques, les prix alimentaires connaissent d’importantes fluctuations.</w:t>
       </w:r>
     </w:p>
     <w:p>
@@ -494,13 +493,9 @@
           <w:sz w:val="24"/>
           <w:szCs w:val="24"/>
         </w:rPr>
-        <w:t>Dans un contexte mondial marqué par des crises climatiques, économiques et géopolitiques, les prix alimentaires connaissent d’importantes fluctuations.</w:t>
-      </w:r>
-    </w:p>
-    <w:p>
-      <w:pPr>
-        <w:pStyle w:val="Quote"/>
-        <w:jc w:val="both"/>
+        <w:t>Ce projet s’inscrit dans le cadre d’une formation en Data Analysis et vise à analyser les déterminants majeurs de l’évolution des prix alimentaires mondiaux entre 2015 et 202</w:t>
+      </w:r>
+      <w:r>
         <w:rPr>
           <w:i w:val="0"/>
           <w:iCs w:val="0"/>
@@ -508,7 +503,8 @@
           <w:sz w:val="24"/>
           <w:szCs w:val="24"/>
         </w:rPr>
-      </w:pPr>
+        <w:t>4</w:t>
+      </w:r>
       <w:r>
         <w:rPr>
           <w:i w:val="0"/>
@@ -517,29 +513,7 @@
           <w:sz w:val="24"/>
           <w:szCs w:val="24"/>
         </w:rPr>
-        <w:t xml:space="preserve">Ce projet s’inscrit dans le cadre d’une formation en Data </w:t>
-      </w:r>
-      <w:proofErr w:type="spellStart"/>
-      <w:r>
-        <w:rPr>
-          <w:i w:val="0"/>
-          <w:iCs w:val="0"/>
-          <w:color w:val="000000" w:themeColor="text1"/>
-          <w:sz w:val="24"/>
-          <w:szCs w:val="24"/>
-        </w:rPr>
-        <w:t>Analysis</w:t>
-      </w:r>
-      <w:proofErr w:type="spellEnd"/>
-      <w:r>
-        <w:rPr>
-          <w:i w:val="0"/>
-          <w:iCs w:val="0"/>
-          <w:color w:val="000000" w:themeColor="text1"/>
-          <w:sz w:val="24"/>
-          <w:szCs w:val="24"/>
-        </w:rPr>
-        <w:t xml:space="preserve"> et vise à analyser les déterminants majeurs de l’évolution des prix alimentaires mondiaux entre 2015 et 2025.</w:t>
+        <w:t>.</w:t>
       </w:r>
     </w:p>
     <w:p>
@@ -711,7 +685,27 @@
           <w:sz w:val="24"/>
           <w:szCs w:val="24"/>
         </w:rPr>
-        <w:t>Quels sont les principaux facteurs économiques et climatiques qui influencent l’évolution des prix alimentaires mondiaux entre 2015 et 2025 ?</w:t>
+        <w:t>Quels sont les principaux facteurs économiques et climatiques qui influencent l’évolution des prix alimentaires mondiaux entre 2015 et 202</w:t>
+      </w:r>
+      <w:r>
+        <w:rPr>
+          <w:i w:val="0"/>
+          <w:iCs w:val="0"/>
+          <w:color w:val="auto"/>
+          <w:sz w:val="24"/>
+          <w:szCs w:val="24"/>
+        </w:rPr>
+        <w:t>4</w:t>
+      </w:r>
+      <w:r>
+        <w:rPr>
+          <w:i w:val="0"/>
+          <w:iCs w:val="0"/>
+          <w:color w:val="auto"/>
+          <w:sz w:val="24"/>
+          <w:szCs w:val="24"/>
+        </w:rPr>
+        <w:t xml:space="preserve"> ?</w:t>
       </w:r>
     </w:p>
     <w:p>
@@ -996,25 +990,7 @@
           <w:sz w:val="24"/>
           <w:szCs w:val="24"/>
         </w:rPr>
-        <w:t xml:space="preserve">Déterminer si certains produits alimentaires </w:t>
-      </w:r>
-      <w:proofErr w:type="gramStart"/>
-      <w:r>
-        <w:rPr>
-          <w:color w:val="000000" w:themeColor="text1"/>
-          <w:sz w:val="24"/>
-          <w:szCs w:val="24"/>
-        </w:rPr>
-        <w:t>sont</w:t>
-      </w:r>
-      <w:proofErr w:type="gramEnd"/>
-      <w:r>
-        <w:rPr>
-          <w:color w:val="000000" w:themeColor="text1"/>
-          <w:sz w:val="24"/>
-          <w:szCs w:val="24"/>
-        </w:rPr>
-        <w:t xml:space="preserve"> plus sensibles aux variations climatiques ou économiques.</w:t>
+        <w:t>Déterminer si certains produits alimentaires sont plus sensibles aux variations climatiques ou économiques.</w:t>
       </w:r>
     </w:p>
     <w:p>
@@ -1101,7 +1077,13 @@
         <w:rPr>
           <w:color w:val="000000" w:themeColor="text1"/>
         </w:rPr>
-        <w:t>2015 – 2025</w:t>
+        <w:t>2015 – 202</w:t>
+      </w:r>
+      <w:r>
+        <w:rPr>
+          <w:color w:val="000000" w:themeColor="text1"/>
+        </w:rPr>
+        <w:t>4</w:t>
       </w:r>
     </w:p>
     <w:p>
@@ -1227,44 +1209,20 @@
           <w:lang w:val="en-US"/>
         </w:rPr>
       </w:pPr>
-      <w:proofErr w:type="gramStart"/>
       <w:r>
         <w:rPr>
           <w:color w:val="000000" w:themeColor="text1"/>
           <w:lang w:val="en-US"/>
         </w:rPr>
-        <w:t>Source :</w:t>
-      </w:r>
-      <w:proofErr w:type="gramEnd"/>
+        <w:t>Source : FAO – Food Price Index</w:t>
+      </w:r>
       <w:r>
         <w:rPr>
           <w:color w:val="000000" w:themeColor="text1"/>
           <w:lang w:val="en-US"/>
         </w:rPr>
-        <w:t xml:space="preserve"> FAO – Food Price Index</w:t>
-      </w:r>
-      <w:r>
-        <w:rPr>
-          <w:color w:val="000000" w:themeColor="text1"/>
-          <w:lang w:val="en-US"/>
-        </w:rPr>
         <w:br/>
-      </w:r>
-      <w:proofErr w:type="gramStart"/>
-      <w:r>
-        <w:rPr>
-          <w:color w:val="000000" w:themeColor="text1"/>
-          <w:lang w:val="en-US"/>
-        </w:rPr>
-        <w:t>Format :</w:t>
-      </w:r>
-      <w:proofErr w:type="gramEnd"/>
-      <w:r>
-        <w:rPr>
-          <w:color w:val="000000" w:themeColor="text1"/>
-          <w:lang w:val="en-US"/>
-        </w:rPr>
-        <w:t xml:space="preserve"> CSV</w:t>
+        <w:t>Format : CSV</w:t>
       </w:r>
     </w:p>
     <w:p>
@@ -1321,51 +1279,27 @@
           <w:lang w:val="en-US"/>
         </w:rPr>
       </w:pPr>
-      <w:proofErr w:type="gramStart"/>
       <w:r>
         <w:rPr>
           <w:color w:val="000000" w:themeColor="text1"/>
           <w:lang w:val="en-US"/>
         </w:rPr>
-        <w:t>Source :</w:t>
-      </w:r>
-      <w:proofErr w:type="gramEnd"/>
+        <w:t xml:space="preserve">Source : FAO – Food Price </w:t>
+      </w:r>
       <w:r>
         <w:rPr>
           <w:color w:val="000000" w:themeColor="text1"/>
           <w:lang w:val="en-US"/>
         </w:rPr>
-        <w:t xml:space="preserve"> FAO – Food Price </w:t>
+        <w:t>Producer</w:t>
       </w:r>
       <w:r>
         <w:rPr>
           <w:color w:val="000000" w:themeColor="text1"/>
           <w:lang w:val="en-US"/>
         </w:rPr>
-        <w:t>Producer</w:t>
-      </w:r>
-      <w:r>
-        <w:rPr>
-          <w:color w:val="000000" w:themeColor="text1"/>
-          <w:lang w:val="en-US"/>
-        </w:rPr>
         <w:br/>
-      </w:r>
-      <w:proofErr w:type="gramStart"/>
-      <w:r>
-        <w:rPr>
-          <w:color w:val="000000" w:themeColor="text1"/>
-          <w:lang w:val="en-US"/>
-        </w:rPr>
-        <w:t>Format :</w:t>
-      </w:r>
-      <w:proofErr w:type="gramEnd"/>
-      <w:r>
-        <w:rPr>
-          <w:color w:val="000000" w:themeColor="text1"/>
-          <w:lang w:val="en-US"/>
-        </w:rPr>
-        <w:t xml:space="preserve"> CSV</w:t>
+        <w:t>Format : CSV</w:t>
       </w:r>
     </w:p>
     <w:p>
@@ -1469,44 +1403,20 @@
           <w:lang w:val="en-US"/>
         </w:rPr>
       </w:pPr>
-      <w:proofErr w:type="gramStart"/>
       <w:r>
         <w:rPr>
           <w:color w:val="000000" w:themeColor="text1"/>
           <w:lang w:val="en-US"/>
         </w:rPr>
-        <w:t>Source :</w:t>
-      </w:r>
-      <w:proofErr w:type="gramEnd"/>
+        <w:t>Source : World Bank API</w:t>
+      </w:r>
       <w:r>
         <w:rPr>
           <w:color w:val="000000" w:themeColor="text1"/>
           <w:lang w:val="en-US"/>
         </w:rPr>
-        <w:t xml:space="preserve"> World Bank API</w:t>
-      </w:r>
-      <w:r>
-        <w:rPr>
-          <w:color w:val="000000" w:themeColor="text1"/>
-          <w:lang w:val="en-US"/>
-        </w:rPr>
         <w:br/>
-      </w:r>
-      <w:proofErr w:type="gramStart"/>
-      <w:r>
-        <w:rPr>
-          <w:color w:val="000000" w:themeColor="text1"/>
-          <w:lang w:val="en-US"/>
-        </w:rPr>
-        <w:t>Format :</w:t>
-      </w:r>
-      <w:proofErr w:type="gramEnd"/>
-      <w:r>
-        <w:rPr>
-          <w:color w:val="000000" w:themeColor="text1"/>
-          <w:lang w:val="en-US"/>
-        </w:rPr>
-        <w:t xml:space="preserve"> JSON → CSV</w:t>
+        <w:t>Format : JSON → CSV</w:t>
       </w:r>
     </w:p>
     <w:p>
@@ -1553,7 +1463,7 @@
         <w:rPr>
           <w:color w:val="000000" w:themeColor="text1"/>
         </w:rPr>
-        <w:t>Producer Price Index (PPI)</w:t>
+        <w:t>PIB</w:t>
       </w:r>
     </w:p>
     <w:p>
@@ -1570,33 +1480,8 @@
         <w:rPr>
           <w:color w:val="000000" w:themeColor="text1"/>
         </w:rPr>
-        <w:t>PIB</w:t>
-      </w:r>
-    </w:p>
-    <w:p>
-      <w:pPr>
-        <w:numPr>
-          <w:ilvl w:val="0"/>
-          <w:numId w:val="19"/>
-        </w:numPr>
-        <w:rPr>
-          <w:color w:val="000000" w:themeColor="text1"/>
-        </w:rPr>
-      </w:pPr>
-      <w:r>
-        <w:rPr>
-          <w:color w:val="000000" w:themeColor="text1"/>
-        </w:rPr>
-        <w:t xml:space="preserve">PIB par </w:t>
-      </w:r>
-      <w:proofErr w:type="spellStart"/>
-      <w:r>
-        <w:rPr>
-          <w:color w:val="000000" w:themeColor="text1"/>
-        </w:rPr>
-        <w:t>habitan</w:t>
-      </w:r>
-      <w:proofErr w:type="spellEnd"/>
+        <w:t>PIB par habitan</w:t>
+      </w:r>
     </w:p>
     <w:p>
       <w:pPr>
@@ -1739,33 +1624,12 @@
     </w:p>
     <w:p>
       <w:r>
-        <w:t xml:space="preserve">Source : CRU TS – </w:t>
-      </w:r>
-      <w:proofErr w:type="spellStart"/>
-      <w:r>
-        <w:t>Climatic</w:t>
-      </w:r>
-      <w:proofErr w:type="spellEnd"/>
-      <w:r>
-        <w:t xml:space="preserve"> </w:t>
-      </w:r>
-      <w:proofErr w:type="spellStart"/>
-      <w:r>
-        <w:t>Research</w:t>
-      </w:r>
-      <w:proofErr w:type="spellEnd"/>
-      <w:r>
-        <w:t xml:space="preserve"> Unit</w:t>
+        <w:t>Source : CRU TS – Climatic Research Unit</w:t>
       </w:r>
       <w:r>
         <w:br/>
-        <w:t xml:space="preserve">Format : </w:t>
-      </w:r>
-      <w:proofErr w:type="spellStart"/>
-      <w:r>
-        <w:t>NetCDF</w:t>
-      </w:r>
-      <w:proofErr w:type="spellEnd"/>
+        <w:t>Format : NetCDF</w:t>
+      </w:r>
       <w:r>
         <w:br/>
         <w:t>Fréquence : Mensuelle</w:t>
@@ -1784,15 +1648,7 @@
         </w:numPr>
       </w:pPr>
       <w:r>
-        <w:t>Température moyenne (</w:t>
-      </w:r>
-      <w:proofErr w:type="spellStart"/>
-      <w:r>
-        <w:t>tmp</w:t>
-      </w:r>
-      <w:proofErr w:type="spellEnd"/>
-      <w:r>
-        <w:t>)</w:t>
+        <w:t>Température moyenne (tmp)</w:t>
       </w:r>
     </w:p>
     <w:p>
@@ -1803,15 +1659,7 @@
         </w:numPr>
       </w:pPr>
       <w:r>
-        <w:t>Précipitations (</w:t>
-      </w:r>
-      <w:proofErr w:type="spellStart"/>
-      <w:r>
-        <w:t>pre</w:t>
-      </w:r>
-      <w:proofErr w:type="spellEnd"/>
-      <w:r>
-        <w:t>)</w:t>
+        <w:t>Précipitations (pre)</w:t>
       </w:r>
     </w:p>
     <w:p>
@@ -1854,7 +1702,6 @@
     </w:p>
     <w:p>
       <w:r>
-        <w:lastRenderedPageBreak/>
         <w:t>Rôle :</w:t>
       </w:r>
       <w:r>
@@ -1989,7 +1836,10 @@
         </w:numPr>
       </w:pPr>
       <w:r>
-        <w:t>PPI</w:t>
+        <w:t>P</w:t>
+      </w:r>
+      <w:r>
+        <w:t>opulation</w:t>
       </w:r>
     </w:p>
     <w:p>
@@ -2002,11 +1852,6 @@
       <w:r>
         <w:t>PIB</w:t>
       </w:r>
-    </w:p>
-    <w:p>
-      <w:pPr>
-        <w:ind w:left="360"/>
-      </w:pPr>
     </w:p>
     <w:p>
       <w:pPr>
@@ -2172,21 +2017,7 @@
         <w:rPr>
           <w:lang w:val="en-US"/>
         </w:rPr>
-        <w:t xml:space="preserve">Python (pandas, </w:t>
-      </w:r>
-      <w:proofErr w:type="spellStart"/>
-      <w:r>
-        <w:rPr>
-          <w:lang w:val="en-US"/>
-        </w:rPr>
-        <w:t>numpy</w:t>
-      </w:r>
-      <w:proofErr w:type="spellEnd"/>
-      <w:r>
-        <w:rPr>
-          <w:lang w:val="en-US"/>
-        </w:rPr>
-        <w:t>, matplotlib, seaborn)</w:t>
+        <w:t>Python (pandas, numpy, matplotlib, seaborn)</w:t>
       </w:r>
     </w:p>
     <w:p>
@@ -2197,16 +2028,11 @@
         </w:numPr>
       </w:pPr>
       <w:r>
-        <w:t>PostgreSQL</w:t>
-      </w:r>
-      <w:r>
-        <w:t xml:space="preserve"> / Oracle / </w:t>
-      </w:r>
-      <w:proofErr w:type="spellStart"/>
-      <w:r>
-        <w:t>Mysql</w:t>
-      </w:r>
-      <w:proofErr w:type="spellEnd"/>
+        <w:t>Power BI</w:t>
+      </w:r>
+      <w:r>
+        <w:t> </w:t>
+      </w:r>
     </w:p>
     <w:p>
       <w:pPr>
@@ -2216,10 +2042,7 @@
         </w:numPr>
       </w:pPr>
       <w:r>
-        <w:t>Power BI</w:t>
-      </w:r>
-      <w:r>
-        <w:t> </w:t>
+        <w:t>Trello</w:t>
       </w:r>
     </w:p>
     <w:p>
@@ -2230,17 +2053,6 @@
         </w:numPr>
       </w:pPr>
       <w:r>
-        <w:t>Trello</w:t>
-      </w:r>
-    </w:p>
-    <w:p>
-      <w:pPr>
-        <w:numPr>
-          <w:ilvl w:val="0"/>
-          <w:numId w:val="15"/>
-        </w:numPr>
-      </w:pPr>
-      <w:r>
         <w:t>Confluence</w:t>
       </w:r>
     </w:p>
@@ -2300,11 +2112,6 @@
     </w:p>
     <w:p>
       <w:pPr>
-        <w:ind w:left="720"/>
-      </w:pPr>
-    </w:p>
-    <w:p>
-      <w:pPr>
         <w:numPr>
           <w:ilvl w:val="0"/>
           <w:numId w:val="16"/>
@@ -2332,13 +2139,8 @@
           <w:numId w:val="13"/>
         </w:numPr>
       </w:pPr>
-      <w:proofErr w:type="gramStart"/>
-      <w:r>
-        <w:t>Script  de</w:t>
-      </w:r>
-      <w:proofErr w:type="gramEnd"/>
-      <w:r>
-        <w:t xml:space="preserve"> </w:t>
+      <w:r>
+        <w:t xml:space="preserve">Script  de </w:t>
       </w:r>
       <w:r>
         <w:t xml:space="preserve">Nettoyage et transformation </w:t>
@@ -2354,13 +2156,10 @@
           <w:numId w:val="16"/>
         </w:numPr>
       </w:pPr>
-      <w:proofErr w:type="spellStart"/>
-      <w:proofErr w:type="gramStart"/>
-      <w:r>
+      <w:r>
+        <w:lastRenderedPageBreak/>
         <w:t>documontation</w:t>
       </w:r>
-      <w:proofErr w:type="spellEnd"/>
-      <w:proofErr w:type="gramEnd"/>
     </w:p>
     <w:p>
       <w:pPr>
@@ -2398,15 +2197,7 @@
         </w:numPr>
       </w:pPr>
       <w:r>
-        <w:t xml:space="preserve">Hétérogénéité des formats (CSV, API, </w:t>
-      </w:r>
-      <w:proofErr w:type="spellStart"/>
-      <w:r>
-        <w:t>NetCDF</w:t>
-      </w:r>
-      <w:proofErr w:type="spellEnd"/>
-      <w:r>
-        <w:t>)</w:t>
+        <w:t>Hétérogénéité des formats (CSV, API)</w:t>
       </w:r>
     </w:p>
     <w:p>

</xml_diff>